<commit_message>
whatever this is, it's working
</commit_message>
<xml_diff>
--- a/ReportInputsTemplate.docx
+++ b/ReportInputsTemplate.docx
@@ -64,7 +64,7 @@
                 <w:sz w:val="22"/>
                 <w:szCs w:val="22"/>
               </w:rPr>
-              <w:t>Test customer</w:t>
+              <w:t>Pedro Automation</w:t>
             </w:r>
           </w:p>
         </w:tc>
@@ -110,7 +110,7 @@
                 <w:sz w:val="22"/>
                 <w:szCs w:val="22"/>
               </w:rPr>
-              <w:t>Test subject</w:t>
+              <w:t>Subject 69</w:t>
             </w:r>
           </w:p>
         </w:tc>
@@ -162,7 +162,7 @@
                 <w:sz w:val="22"/>
                 <w:szCs w:val="22"/>
               </w:rPr>
-              <w:t>Placeholder address</w:t>
+              <w:t>Beverly Hills</w:t>
             </w:r>
           </w:p>
         </w:tc>
@@ -208,7 +208,7 @@
                 <w:sz w:val="22"/>
                 <w:szCs w:val="22"/>
               </w:rPr>
-              <w:t>Placeholder from</w:t>
+              <w:t>From some person</w:t>
             </w:r>
           </w:p>
         </w:tc>
@@ -260,7 +260,7 @@
                 <w:sz w:val="22"/>
                 <w:szCs w:val="22"/>
               </w:rPr>
-              <w:t>Placeholder contact</w:t>
+              <w:t>me@gmail.com</w:t>
             </w:r>
           </w:p>
         </w:tc>
@@ -308,7 +308,7 @@
                 <w:sz w:val="22"/>
                 <w:szCs w:val="22"/>
               </w:rPr>
-              <w:t>Maverick Applied Science, Inc.</w:t>
+              <w:t>Another company</w:t>
             </w:r>
           </w:p>
         </w:tc>
@@ -362,7 +362,7 @@
                 <w:sz w:val="22"/>
                 <w:szCs w:val="22"/>
               </w:rPr>
-              <w:t>Placeholder site</w:t>
+              <w:t>My house</w:t>
             </w:r>
           </w:p>
         </w:tc>
@@ -415,7 +415,7 @@
                 <w:sz w:val="22"/>
                 <w:szCs w:val="22"/>
               </w:rPr>
-              <w:t>89264981267</w:t>
+              <w:t>6969696</w:t>
             </w:r>
           </w:p>
           <w:p>
@@ -438,7 +438,21 @@
                 <w:sz w:val="22"/>
                 <w:szCs w:val="22"/>
               </w:rPr>
-              <w:t>www@gmail.com</w:t>
+              <w:t>www</w:t>
+            </w:r>
+            <w:r>
+              <w:rPr>
+                <w:sz w:val="22"/>
+                <w:szCs w:val="22"/>
+              </w:rPr>
+              <w:t>6969</w:t>
+            </w:r>
+            <w:r>
+              <w:rPr>
+                <w:sz w:val="22"/>
+                <w:szCs w:val="22"/>
+              </w:rPr>
+              <w:t>@gmail.com</w:t>
             </w:r>
           </w:p>
         </w:tc>
@@ -490,7 +504,7 @@
                 <w:sz w:val="22"/>
                 <w:szCs w:val="22"/>
               </w:rPr>
-              <w:t>09435683046739878</w:t>
+              <w:t>69696</w:t>
             </w:r>
           </w:p>
         </w:tc>
@@ -535,7 +549,21 @@
                 <w:sz w:val="22"/>
                 <w:szCs w:val="22"/>
               </w:rPr>
-              <w:t>20243121-1</w:t>
+              <w:t>20243121</w:t>
+            </w:r>
+            <w:r>
+              <w:rPr>
+                <w:sz w:val="22"/>
+                <w:szCs w:val="22"/>
+              </w:rPr>
+              <w:t>69</w:t>
+            </w:r>
+            <w:r>
+              <w:rPr>
+                <w:sz w:val="22"/>
+                <w:szCs w:val="22"/>
+              </w:rPr>
+              <w:t>-1</w:t>
             </w:r>
           </w:p>
         </w:tc>
@@ -587,7 +615,7 @@
                 <w:sz w:val="22"/>
                 <w:szCs w:val="22"/>
               </w:rPr>
-              <w:t>Placeholder ccs</w:t>
+              <w:t>Customer CCs 69</w:t>
             </w:r>
           </w:p>
         </w:tc>
@@ -633,7 +661,7 @@
                 <w:sz w:val="22"/>
                 <w:szCs w:val="22"/>
               </w:rPr>
-              <w:t>D. Mikulec; MAS Technical Director</w:t>
+              <w:t>The head huncho</w:t>
             </w:r>
           </w:p>
         </w:tc>
@@ -684,7 +712,21 @@
                 <w:sz w:val="22"/>
                 <w:szCs w:val="22"/>
               </w:rPr>
-              <w:t>9/17/2024</w:t>
+              <w:t>9/</w:t>
+            </w:r>
+            <w:r>
+              <w:rPr>
+                <w:sz w:val="22"/>
+                <w:szCs w:val="22"/>
+              </w:rPr>
+              <w:t>29</w:t>
+            </w:r>
+            <w:r>
+              <w:rPr>
+                <w:sz w:val="22"/>
+                <w:szCs w:val="22"/>
+              </w:rPr>
+              <w:t>/2024</w:t>
             </w:r>
           </w:p>
         </w:tc>
@@ -729,7 +771,28 @@
                 <w:sz w:val="22"/>
                 <w:szCs w:val="22"/>
               </w:rPr>
-              <w:t>9/18/2024</w:t>
+              <w:t>10</w:t>
+            </w:r>
+            <w:r>
+              <w:rPr>
+                <w:sz w:val="22"/>
+                <w:szCs w:val="22"/>
+              </w:rPr>
+              <w:t>/</w:t>
+            </w:r>
+            <w:r>
+              <w:rPr>
+                <w:sz w:val="22"/>
+                <w:szCs w:val="22"/>
+              </w:rPr>
+              <w:t>03</w:t>
+            </w:r>
+            <w:r>
+              <w:rPr>
+                <w:sz w:val="22"/>
+                <w:szCs w:val="22"/>
+              </w:rPr>
+              <w:t>/2024</w:t>
             </w:r>
           </w:p>
         </w:tc>
@@ -782,7 +845,14 @@
                 <w:sz w:val="22"/>
                 <w:szCs w:val="22"/>
               </w:rPr>
-              <w:t>Example intro</w:t>
+              <w:t xml:space="preserve">We met the people in the </w:t>
+            </w:r>
+            <w:r>
+              <w:rPr>
+                <w:sz w:val="22"/>
+                <w:szCs w:val="22"/>
+              </w:rPr>
+              <w:t>plant and it was awful</w:t>
             </w:r>
           </w:p>
         </w:tc>
@@ -835,7 +905,7 @@
                 <w:sz w:val="22"/>
                 <w:szCs w:val="22"/>
               </w:rPr>
-              <w:t>Example entrance</w:t>
+              <w:t>The entrance meeting showed us around and followed us like puppies</w:t>
             </w:r>
           </w:p>
         </w:tc>
@@ -897,7 +967,14 @@
                 <w:sz w:val="22"/>
                 <w:szCs w:val="22"/>
               </w:rPr>
-              <w:t xml:space="preserve">Test 1 </w:t>
+              <w:t>6969</w:t>
+            </w:r>
+            <w:r>
+              <w:rPr>
+                <w:sz w:val="22"/>
+                <w:szCs w:val="22"/>
+              </w:rPr>
+              <w:t>DWG</w:t>
             </w:r>
           </w:p>
         </w:tc>
@@ -926,7 +1003,7 @@
                 <w:sz w:val="22"/>
                 <w:szCs w:val="22"/>
               </w:rPr>
-              <w:t>Test 2</w:t>
+              <w:t>24242DWG</w:t>
             </w:r>
           </w:p>
         </w:tc>
@@ -955,7 +1032,7 @@
                 <w:sz w:val="22"/>
                 <w:szCs w:val="22"/>
               </w:rPr>
-              <w:t>Test 3</w:t>
+              <w:t>6767DWG</w:t>
             </w:r>
           </w:p>
         </w:tc>
@@ -984,7 +1061,7 @@
                 <w:sz w:val="22"/>
                 <w:szCs w:val="22"/>
               </w:rPr>
-              <w:t>Test 4</w:t>
+              <w:t>8989DWG</w:t>
             </w:r>
           </w:p>
         </w:tc>
@@ -1046,7 +1123,7 @@
                 <w:sz w:val="22"/>
                 <w:szCs w:val="22"/>
               </w:rPr>
-              <w:t>Test 1</w:t>
+              <w:t>008098SPEC</w:t>
             </w:r>
           </w:p>
         </w:tc>
@@ -1075,7 +1152,7 @@
                 <w:sz w:val="22"/>
                 <w:szCs w:val="22"/>
               </w:rPr>
-              <w:t>Test 2</w:t>
+              <w:t>08080SPEC</w:t>
             </w:r>
           </w:p>
         </w:tc>
@@ -1104,7 +1181,7 @@
                 <w:sz w:val="22"/>
                 <w:szCs w:val="22"/>
               </w:rPr>
-              <w:t>Test 3</w:t>
+              <w:t>0909SPEC</w:t>
             </w:r>
           </w:p>
         </w:tc>
@@ -1156,7 +1233,14 @@
                 <w:sz w:val="22"/>
                 <w:szCs w:val="22"/>
               </w:rPr>
-              <w:t>Example conclusion</w:t>
+              <w:t>This is my fucking conclusion</w:t>
+            </w:r>
+            <w:r>
+              <w:rPr>
+                <w:sz w:val="22"/>
+                <w:szCs w:val="22"/>
+              </w:rPr>
+              <w:t xml:space="preserve"> and recommendation.</w:t>
             </w:r>
           </w:p>
         </w:tc>
@@ -1458,7 +1542,15 @@
                 <w:sz w:val="22"/>
                 <w:szCs w:val="22"/>
               </w:rPr>
-              <w:t>Figure shows unknown material leaking from pipe nozzle or similar connection.</w:t>
+              <w:t>U</w:t>
+            </w:r>
+            <w:r>
+              <w:rPr>
+                <w:rFonts w:ascii="Calibri" w:hAnsi="Calibri" w:cs="Calibri"/>
+                <w:sz w:val="22"/>
+                <w:szCs w:val="22"/>
+              </w:rPr>
+              <w:t>nknown material leaking from pipe nozzle or similar connection.</w:t>
             </w:r>
           </w:p>
         </w:tc>
@@ -1593,7 +1685,7 @@
                 <w:sz w:val="22"/>
                 <w:szCs w:val="22"/>
               </w:rPr>
-              <w:t>Test 3</w:t>
+              <w:t>Corroded tank grounding lug</w:t>
             </w:r>
           </w:p>
         </w:tc>
@@ -1621,7 +1713,7 @@
                 <w:sz w:val="22"/>
                 <w:szCs w:val="22"/>
               </w:rPr>
-              <w:t>Test 3</w:t>
+              <w:t>Tank 8383 grounding lug</w:t>
             </w:r>
           </w:p>
         </w:tc>
@@ -1729,7 +1821,7 @@
                 <w:szCs w:val="22"/>
               </w:rPr>
               <w:lastRenderedPageBreak/>
-              <w:t>Test 4</w:t>
+              <w:t>Delamination of tank</w:t>
             </w:r>
           </w:p>
         </w:tc>
@@ -1757,7 +1849,7 @@
                 <w:sz w:val="22"/>
                 <w:szCs w:val="22"/>
               </w:rPr>
-              <w:t>Test4</w:t>
+              <w:t>Tank so and so delamination</w:t>
             </w:r>
           </w:p>
         </w:tc>
@@ -1857,6 +1949,14 @@
                 <w:szCs w:val="22"/>
               </w:rPr>
             </w:pPr>
+            <w:r>
+              <w:rPr>
+                <w:rFonts w:ascii="Calibri" w:hAnsi="Calibri" w:cs="Calibri"/>
+                <w:sz w:val="22"/>
+                <w:szCs w:val="22"/>
+              </w:rPr>
+              <w:t>Delamination of train B</w:t>
+            </w:r>
           </w:p>
         </w:tc>
         <w:tc>
@@ -1877,6 +1977,14 @@
                 <w:szCs w:val="22"/>
               </w:rPr>
             </w:pPr>
+            <w:r>
+              <w:rPr>
+                <w:rFonts w:ascii="Calibri" w:hAnsi="Calibri" w:cs="Calibri"/>
+                <w:sz w:val="22"/>
+                <w:szCs w:val="22"/>
+              </w:rPr>
+              <w:t>Tank so and so train B delamination</w:t>
+            </w:r>
           </w:p>
         </w:tc>
         <w:tc>
@@ -1897,6 +2005,59 @@
                 <w:szCs w:val="22"/>
               </w:rPr>
             </w:pPr>
+            <w:r>
+              <w:rPr>
+                <w:noProof/>
+              </w:rPr>
+              <w:drawing>
+                <wp:inline distT="0" distB="0" distL="0" distR="0" wp14:anchorId="52AE44C8" wp14:editId="02918AFF">
+                  <wp:extent cx="3295650" cy="2466975"/>
+                  <wp:effectExtent l="0" t="0" r="0" b="9525"/>
+                  <wp:docPr id="263311646" name="Picture 2"/>
+                  <wp:cNvGraphicFramePr>
+                    <a:graphicFrameLocks xmlns:a="http://schemas.openxmlformats.org/drawingml/2006/main" noChangeAspect="1"/>
+                  </wp:cNvGraphicFramePr>
+                  <a:graphic xmlns:a="http://schemas.openxmlformats.org/drawingml/2006/main">
+                    <a:graphicData uri="http://schemas.openxmlformats.org/drawingml/2006/picture">
+                      <pic:pic xmlns:pic="http://schemas.openxmlformats.org/drawingml/2006/picture">
+                        <pic:nvPicPr>
+                          <pic:cNvPr id="0" name="Picture 3"/>
+                          <pic:cNvPicPr>
+                            <a:picLocks noChangeAspect="1" noChangeArrowheads="1"/>
+                          </pic:cNvPicPr>
+                        </pic:nvPicPr>
+                        <pic:blipFill>
+                          <a:blip r:embed="rId8">
+                            <a:extLst>
+                              <a:ext uri="{28A0092B-C50C-407E-A947-70E740481C1C}">
+                                <a14:useLocalDpi xmlns:a14="http://schemas.microsoft.com/office/drawing/2010/main" val="0"/>
+                              </a:ext>
+                            </a:extLst>
+                          </a:blip>
+                          <a:srcRect/>
+                          <a:stretch>
+                            <a:fillRect/>
+                          </a:stretch>
+                        </pic:blipFill>
+                        <pic:spPr bwMode="auto">
+                          <a:xfrm>
+                            <a:off x="0" y="0"/>
+                            <a:ext cx="3295650" cy="2466975"/>
+                          </a:xfrm>
+                          <a:prstGeom prst="rect">
+                            <a:avLst/>
+                          </a:prstGeom>
+                          <a:noFill/>
+                          <a:ln>
+                            <a:noFill/>
+                          </a:ln>
+                        </pic:spPr>
+                      </pic:pic>
+                    </a:graphicData>
+                  </a:graphic>
+                </wp:inline>
+              </w:drawing>
+            </w:r>
           </w:p>
         </w:tc>
       </w:tr>

</xml_diff>